<commit_message>
Draft chapters 14 (Zielinski) and 15 (LaBranche); complete the Jones+Carpenter interlude
- ch14 'The Blind Photo From Inside a Pocket': the accidental geotagged
  pocket photo placing Zielinski a nine-minute drive from the Lino Lakes
  robbery-murder; told honestly (court says the case was overwhelming even
  without it - cell data + DNA on the stolen safe). Uses the opinion's
  'nine-minute drive,' not the press '4.3 miles.'
- ch15 'The Cameras on the Interstate': LaBranche fled a Metairie double
  murder in his dead sister's distinctive chrome-trim Honda; ALPR clocked
  it up I-55; plus confession. Louisiana's ALPR case.
- interlude: Carpenter folded in fully (Detroit robberies, 127 days of
  warrantless cell-site data = a search). Part II framing now complete.
- Master now 31 chapters + interlude.

Co-Authored-By: Claude Opus 4.8 <noreply@anthropic.com>
Claude-Session: https://claude.ai/code/session_016HAHAXcMmaZghEz1kJrDWU
</commit_message>
<xml_diff>
--- a/book/word/Interlude - The Rules of the Road (Jones, Carpenter).docx
+++ b/book/word/Interlude - The Rules of the Road (Jones, Carpenter).docx
@@ -282,37 +282,93 @@
         <w:t xml:space="preserve"> </w:t>
       </w:r>
       <w:r>
-        <w:t xml:space="preserve">over. There the government had obtained months of historical cell-site location</w:t>
-      </w:r>
-      <w:r>
-        <w:t xml:space="preserve"> </w:t>
-      </w:r>
-      <w:r>
-        <w:t xml:space="preserve">records, the log of which towers a suspect’s phone connected to, without a warrant,</w:t>
-      </w:r>
-      <w:r>
-        <w:t xml:space="preserve"> </w:t>
-      </w:r>
-      <w:r>
-        <w:t xml:space="preserve">and used them to place him near a string of robberies. The Court held that</w:t>
-      </w:r>
-      <w:r>
-        <w:t xml:space="preserve"> </w:t>
-      </w:r>
-      <w:r>
-        <w:t xml:space="preserve">acquiring that kind of pervasive, long-term location history is also a search</w:t>
-      </w:r>
-      <w:r>
-        <w:t xml:space="preserve"> </w:t>
-      </w:r>
-      <w:r>
-        <w:t xml:space="preserve">requiring a warrant, refusing to treat the digital trail we leave with our phone</w:t>
-      </w:r>
-      <w:r>
-        <w:t xml:space="preserve"> </w:t>
-      </w:r>
-      <w:r>
-        <w:t xml:space="preserve">companies as fair game simply because a third party holds it.</w:t>
+        <w:t xml:space="preserve">over. Timothy Carpenter was tied to a string of armed robberies at RadioShack and</w:t>
+      </w:r>
+      <w:r>
+        <w:t xml:space="preserve"> </w:t>
+      </w:r>
+      <w:r>
+        <w:t xml:space="preserve">T-Mobile stores around Detroit after an accomplice named him. To build the case,</w:t>
+      </w:r>
+      <w:r>
+        <w:t xml:space="preserve"> </w:t>
+      </w:r>
+      <w:r>
+        <w:t xml:space="preserve">the government obtained, without a warrant, months of Carpenter’s historical</w:t>
+      </w:r>
+      <w:r>
+        <w:t xml:space="preserve"> </w:t>
+      </w:r>
+      <w:r>
+        <w:t xml:space="preserve">cell-site location information, the log of which cell towers his phone had</w:t>
+      </w:r>
+      <w:r>
+        <w:t xml:space="preserve"> </w:t>
+      </w:r>
+      <w:r>
+        <w:t xml:space="preserve">connected to, roughly 127 days of it, placing his phone near robbery after</w:t>
+      </w:r>
+      <w:r>
+        <w:t xml:space="preserve"> </w:t>
+      </w:r>
+      <w:r>
+        <w:t xml:space="preserve">robbery. The government’s theory was that this was fair game because the records</w:t>
+      </w:r>
+      <w:r>
+        <w:t xml:space="preserve"> </w:t>
+      </w:r>
+      <w:r>
+        <w:t xml:space="preserve">belonged to the phone company, not to Carpenter, under the old rule that you</w:t>
+      </w:r>
+      <w:r>
+        <w:t xml:space="preserve"> </w:t>
+      </w:r>
+      <w:r>
+        <w:t xml:space="preserve">surrender your privacy in information you hand to a third party.</w:t>
+      </w:r>
+    </w:p>
+    <w:p>
+      <w:pPr>
+        <w:pStyle w:val="BodyText"/>
+      </w:pPr>
+      <w:r>
+        <w:t xml:space="preserve">The Court refused to go there. Acquiring that kind of pervasive, long-term record</w:t>
+      </w:r>
+      <w:r>
+        <w:t xml:space="preserve"> </w:t>
+      </w:r>
+      <w:r>
+        <w:t xml:space="preserve">of a person’s movements, it held, is a Fourth Amendment search that requires a</w:t>
+      </w:r>
+      <w:r>
+        <w:t xml:space="preserve"> </w:t>
+      </w:r>
+      <w:r>
+        <w:t xml:space="preserve">warrant, even though a phone company holds the data, because a comprehensive log</w:t>
+      </w:r>
+      <w:r>
+        <w:t xml:space="preserve"> </w:t>
+      </w:r>
+      <w:r>
+        <w:t xml:space="preserve">of everywhere you have been is exactly the sort of intimate portrait the Amendment</w:t>
+      </w:r>
+      <w:r>
+        <w:t xml:space="preserve"> </w:t>
+      </w:r>
+      <w:r>
+        <w:t xml:space="preserve">protects. Modern life forces us to leave a locational trail with our carriers</w:t>
+      </w:r>
+      <w:r>
+        <w:t xml:space="preserve"> </w:t>
+      </w:r>
+      <w:r>
+        <w:t xml:space="preserve">simply by owning a phone; that necessity, the Court reasoned, cannot mean we</w:t>
+      </w:r>
+      <w:r>
+        <w:t xml:space="preserve"> </w:t>
+      </w:r>
+      <w:r>
+        <w:t xml:space="preserve">surrender the right to keep the government from freely reading it.</w:t>
       </w:r>
       <w:r>
         <w:t xml:space="preserve"> </w:t>
@@ -322,35 +378,31 @@
           <w:iCs/>
           <w:i/>
         </w:rPr>
-        <w:t xml:space="preserve">(Carpenter is the</w:t>
-      </w:r>
-      <w:r>
-        <w:rPr>
-          <w:iCs/>
-          <w:i/>
-        </w:rPr>
-        <w:t xml:space="preserve"> </w:t>
-      </w:r>
-      <w:r>
-        <w:rPr>
-          <w:iCs/>
-          <w:i/>
-        </w:rPr>
-        <w:t xml:space="preserve">essential companion to this interlude; its own chapter-length treatment can be</w:t>
-      </w:r>
-      <w:r>
-        <w:rPr>
-          <w:iCs/>
-          <w:i/>
-        </w:rPr>
-        <w:t xml:space="preserve"> </w:t>
-      </w:r>
-      <w:r>
-        <w:rPr>
-          <w:iCs/>
-          <w:i/>
-        </w:rPr>
-        <w:t xml:space="preserve">slotted here once the decision is in hand.)</w:t>
+        <w:t xml:space="preserve">Carpenter</w:t>
+      </w:r>
+      <w:r>
+        <w:t xml:space="preserve"> </w:t>
+      </w:r>
+      <w:r>
+        <w:t xml:space="preserve">is</w:t>
+      </w:r>
+      <w:r>
+        <w:t xml:space="preserve"> </w:t>
+      </w:r>
+      <w:r>
+        <w:t xml:space="preserve">the essential backdrop to every chapter in this book where historical cell-tower</w:t>
+      </w:r>
+      <w:r>
+        <w:t xml:space="preserve"> </w:t>
+      </w:r>
+      <w:r>
+        <w:t xml:space="preserve">records place a killer, from the two phones on the same towers in the Millard</w:t>
+      </w:r>
+      <w:r>
+        <w:t xml:space="preserve"> </w:t>
+      </w:r>
+      <w:r>
+        <w:t xml:space="preserve">cases to the timeline that helped convict Jennifer Pan.</w:t>
       </w:r>
     </w:p>
     <w:p>

</xml_diff>